<commit_message>
Actualizacion con base de datos
Actualizar
</commit_message>
<xml_diff>
--- a/Fase 2/Evidencias Proyecto/Evidencias de sistema  Aplicación.docx
+++ b/Fase 2/Evidencias Proyecto/Evidencias de sistema  Aplicación.docx
@@ -244,12 +244,12 @@
           <wp:inline distB="19050" distT="19050" distL="19050" distR="19050">
             <wp:extent cx="3121550" cy="5289087"/>
             <wp:effectExtent b="0" l="0" r="0" t="0"/>
-            <wp:docPr id="3" name="image5.png"/>
+            <wp:docPr id="3" name="image4.png"/>
             <a:graphic>
               <a:graphicData uri="http://schemas.openxmlformats.org/drawingml/2006/picture">
                 <pic:pic>
                   <pic:nvPicPr>
-                    <pic:cNvPr id="0" name="image5.png"/>
+                    <pic:cNvPr id="0" name="image4.png"/>
                     <pic:cNvPicPr preferRelativeResize="0"/>
                   </pic:nvPicPr>
                   <pic:blipFill>
@@ -1012,12 +1012,12 @@
           <wp:inline distB="114300" distT="114300" distL="114300" distR="114300">
             <wp:extent cx="4114800" cy="7534275"/>
             <wp:effectExtent b="0" l="0" r="0" t="0"/>
-            <wp:docPr id="2" name="image4.png"/>
+            <wp:docPr id="2" name="image6.png"/>
             <a:graphic>
               <a:graphicData uri="http://schemas.openxmlformats.org/drawingml/2006/picture">
                 <pic:pic>
                   <pic:nvPicPr>
-                    <pic:cNvPr id="0" name="image4.png"/>
+                    <pic:cNvPr id="0" name="image6.png"/>
                     <pic:cNvPicPr preferRelativeResize="0"/>
                   </pic:nvPicPr>
                   <pic:blipFill>
@@ -1146,12 +1146,12 @@
           <wp:inline distB="114300" distT="114300" distL="114300" distR="114300">
             <wp:extent cx="4162425" cy="7543800"/>
             <wp:effectExtent b="0" l="0" r="0" t="0"/>
-            <wp:docPr id="5" name="image6.png"/>
+            <wp:docPr id="5" name="image5.png"/>
             <a:graphic>
               <a:graphicData uri="http://schemas.openxmlformats.org/drawingml/2006/picture">
                 <pic:pic>
                   <pic:nvPicPr>
-                    <pic:cNvPr id="0" name="image6.png"/>
+                    <pic:cNvPr id="0" name="image5.png"/>
                     <pic:cNvPicPr preferRelativeResize="0"/>
                   </pic:nvPicPr>
                   <pic:blipFill>

</xml_diff>